<commit_message>
Added Update Car API
</commit_message>
<xml_diff>
--- a/Tanishka_Salve.docx
+++ b/Tanishka_Salve.docx
@@ -24,6 +24,91 @@
                   </pic:nvPicPr>
                   <pic:blipFill>
                     <a:blip r:embed="rId4"/>
+                    <a:stretch>
+                      <a:fillRect/>
+                    </a:stretch>
+                  </pic:blipFill>
+                  <pic:spPr>
+                    <a:xfrm>
+                      <a:off x="0" y="0"/>
+                      <a:ext cx="5731510" cy="3582035"/>
+                    </a:xfrm>
+                    <a:prstGeom prst="rect">
+                      <a:avLst/>
+                    </a:prstGeom>
+                  </pic:spPr>
+                </pic:pic>
+              </a:graphicData>
+            </a:graphic>
+          </wp:inline>
+        </w:drawing>
+      </w:r>
+    </w:p>
+    <w:p>
+      <w:r>
+        <w:rPr>
+          <w:noProof/>
+        </w:rPr>
+        <w:drawing>
+          <wp:inline distT="0" distB="0" distL="0" distR="0" wp14:anchorId="34DC5FB7" wp14:editId="02E9895D">
+            <wp:extent cx="5731510" cy="3582035"/>
+            <wp:effectExtent l="0" t="0" r="2540" b="0"/>
+            <wp:docPr id="647010437" name="Picture 1"/>
+            <wp:cNvGraphicFramePr>
+              <a:graphicFrameLocks xmlns:a="http://schemas.openxmlformats.org/drawingml/2006/main" noChangeAspect="1"/>
+            </wp:cNvGraphicFramePr>
+            <a:graphic xmlns:a="http://schemas.openxmlformats.org/drawingml/2006/main">
+              <a:graphicData uri="http://schemas.openxmlformats.org/drawingml/2006/picture">
+                <pic:pic xmlns:pic="http://schemas.openxmlformats.org/drawingml/2006/picture">
+                  <pic:nvPicPr>
+                    <pic:cNvPr id="647010437" name=""/>
+                    <pic:cNvPicPr/>
+                  </pic:nvPicPr>
+                  <pic:blipFill>
+                    <a:blip r:embed="rId5"/>
+                    <a:stretch>
+                      <a:fillRect/>
+                    </a:stretch>
+                  </pic:blipFill>
+                  <pic:spPr>
+                    <a:xfrm>
+                      <a:off x="0" y="0"/>
+                      <a:ext cx="5731510" cy="3582035"/>
+                    </a:xfrm>
+                    <a:prstGeom prst="rect">
+                      <a:avLst/>
+                    </a:prstGeom>
+                  </pic:spPr>
+                </pic:pic>
+              </a:graphicData>
+            </a:graphic>
+          </wp:inline>
+        </w:drawing>
+      </w:r>
+    </w:p>
+    <w:p>
+      <w:r>
+        <w:rPr>
+          <w:noProof/>
+        </w:rPr>
+        <w:lastRenderedPageBreak/>
+        <w:drawing>
+          <wp:inline distT="0" distB="0" distL="0" distR="0" wp14:anchorId="516FEB15" wp14:editId="37CB8B3A">
+            <wp:extent cx="5731510" cy="3582035"/>
+            <wp:effectExtent l="0" t="0" r="2540" b="0"/>
+            <wp:docPr id="725037403" name="Picture 1"/>
+            <wp:cNvGraphicFramePr>
+              <a:graphicFrameLocks xmlns:a="http://schemas.openxmlformats.org/drawingml/2006/main" noChangeAspect="1"/>
+            </wp:cNvGraphicFramePr>
+            <a:graphic xmlns:a="http://schemas.openxmlformats.org/drawingml/2006/main">
+              <a:graphicData uri="http://schemas.openxmlformats.org/drawingml/2006/picture">
+                <pic:pic xmlns:pic="http://schemas.openxmlformats.org/drawingml/2006/picture">
+                  <pic:nvPicPr>
+                    <pic:cNvPr id="725037403" name=""/>
+                    <pic:cNvPicPr/>
+                  </pic:nvPicPr>
+                  <pic:blipFill>
+                    <a:blip r:embed="rId6"/>
                     <a:stretch>
                       <a:fillRect/>
                     </a:stretch>

</xml_diff>

<commit_message>
Added Profile API with JWT authentication
</commit_message>
<xml_diff>
--- a/Tanishka_Salve.docx
+++ b/Tanishka_Salve.docx
@@ -301,6 +301,48 @@
                   </pic:nvPicPr>
                   <pic:blipFill>
                     <a:blip r:embed="rId10"/>
+                    <a:stretch>
+                      <a:fillRect/>
+                    </a:stretch>
+                  </pic:blipFill>
+                  <pic:spPr>
+                    <a:xfrm>
+                      <a:off x="0" y="0"/>
+                      <a:ext cx="5731510" cy="3582035"/>
+                    </a:xfrm>
+                    <a:prstGeom prst="rect">
+                      <a:avLst/>
+                    </a:prstGeom>
+                  </pic:spPr>
+                </pic:pic>
+              </a:graphicData>
+            </a:graphic>
+          </wp:inline>
+        </w:drawing>
+      </w:r>
+    </w:p>
+    <w:p>
+      <w:r>
+        <w:rPr>
+          <w:noProof/>
+        </w:rPr>
+        <w:drawing>
+          <wp:inline distT="0" distB="0" distL="0" distR="0" wp14:anchorId="004806E5" wp14:editId="65086298">
+            <wp:extent cx="5731510" cy="3582035"/>
+            <wp:effectExtent l="0" t="0" r="2540" b="0"/>
+            <wp:docPr id="52597898" name="Picture 1"/>
+            <wp:cNvGraphicFramePr>
+              <a:graphicFrameLocks xmlns:a="http://schemas.openxmlformats.org/drawingml/2006/main" noChangeAspect="1"/>
+            </wp:cNvGraphicFramePr>
+            <a:graphic xmlns:a="http://schemas.openxmlformats.org/drawingml/2006/main">
+              <a:graphicData uri="http://schemas.openxmlformats.org/drawingml/2006/picture">
+                <pic:pic xmlns:pic="http://schemas.openxmlformats.org/drawingml/2006/picture">
+                  <pic:nvPicPr>
+                    <pic:cNvPr id="52597898" name=""/>
+                    <pic:cNvPicPr/>
+                  </pic:nvPicPr>
+                  <pic:blipFill>
+                    <a:blip r:embed="rId11"/>
                     <a:stretch>
                       <a:fillRect/>
                     </a:stretch>

</xml_diff>

<commit_message>
Added Delete WorkOrder API
</commit_message>
<xml_diff>
--- a/Tanishka_Salve.docx
+++ b/Tanishka_Salve.docx
@@ -322,6 +322,11 @@
       </w:r>
     </w:p>
     <w:p>
+      <w:pPr>
+        <w:rPr>
+          <w:noProof/>
+        </w:rPr>
+      </w:pPr>
       <w:r>
         <w:rPr>
           <w:noProof/>
@@ -343,6 +348,283 @@
                   </pic:nvPicPr>
                   <pic:blipFill>
                     <a:blip r:embed="rId11"/>
+                    <a:stretch>
+                      <a:fillRect/>
+                    </a:stretch>
+                  </pic:blipFill>
+                  <pic:spPr>
+                    <a:xfrm>
+                      <a:off x="0" y="0"/>
+                      <a:ext cx="5731510" cy="3582035"/>
+                    </a:xfrm>
+                    <a:prstGeom prst="rect">
+                      <a:avLst/>
+                    </a:prstGeom>
+                  </pic:spPr>
+                </pic:pic>
+              </a:graphicData>
+            </a:graphic>
+          </wp:inline>
+        </w:drawing>
+      </w:r>
+    </w:p>
+    <w:p/>
+    <w:p/>
+    <w:p>
+      <w:pPr>
+        <w:rPr>
+          <w:noProof/>
+        </w:rPr>
+      </w:pPr>
+    </w:p>
+    <w:p>
+      <w:pPr>
+        <w:ind w:firstLine="720"/>
+      </w:pPr>
+      <w:r>
+        <w:t>-----------------</w:t>
+      </w:r>
+    </w:p>
+    <w:p>
+      <w:pPr>
+        <w:ind w:firstLine="720"/>
+      </w:pPr>
+      <w:r>
+        <w:lastRenderedPageBreak/>
+        <w:t>Workorder:</w:t>
+      </w:r>
+    </w:p>
+    <w:p>
+      <w:pPr>
+        <w:ind w:firstLine="720"/>
+      </w:pPr>
+      <w:r>
+        <w:rPr>
+          <w:noProof/>
+        </w:rPr>
+        <w:drawing>
+          <wp:inline distT="0" distB="0" distL="0" distR="0" wp14:anchorId="783AB5E8" wp14:editId="13E6B022">
+            <wp:extent cx="5731510" cy="3582035"/>
+            <wp:effectExtent l="0" t="0" r="2540" b="0"/>
+            <wp:docPr id="1598233053" name="Picture 1"/>
+            <wp:cNvGraphicFramePr>
+              <a:graphicFrameLocks xmlns:a="http://schemas.openxmlformats.org/drawingml/2006/main" noChangeAspect="1"/>
+            </wp:cNvGraphicFramePr>
+            <a:graphic xmlns:a="http://schemas.openxmlformats.org/drawingml/2006/main">
+              <a:graphicData uri="http://schemas.openxmlformats.org/drawingml/2006/picture">
+                <pic:pic xmlns:pic="http://schemas.openxmlformats.org/drawingml/2006/picture">
+                  <pic:nvPicPr>
+                    <pic:cNvPr id="1598233053" name=""/>
+                    <pic:cNvPicPr/>
+                  </pic:nvPicPr>
+                  <pic:blipFill>
+                    <a:blip r:embed="rId12"/>
+                    <a:stretch>
+                      <a:fillRect/>
+                    </a:stretch>
+                  </pic:blipFill>
+                  <pic:spPr>
+                    <a:xfrm>
+                      <a:off x="0" y="0"/>
+                      <a:ext cx="5731510" cy="3582035"/>
+                    </a:xfrm>
+                    <a:prstGeom prst="rect">
+                      <a:avLst/>
+                    </a:prstGeom>
+                  </pic:spPr>
+                </pic:pic>
+              </a:graphicData>
+            </a:graphic>
+          </wp:inline>
+        </w:drawing>
+      </w:r>
+    </w:p>
+    <w:p>
+      <w:pPr>
+        <w:ind w:firstLine="720"/>
+      </w:pPr>
+      <w:r>
+        <w:t>Get all</w:t>
+      </w:r>
+    </w:p>
+    <w:p>
+      <w:pPr>
+        <w:ind w:firstLine="720"/>
+      </w:pPr>
+      <w:r>
+        <w:rPr>
+          <w:noProof/>
+        </w:rPr>
+        <w:drawing>
+          <wp:inline distT="0" distB="0" distL="0" distR="0" wp14:anchorId="21F098EE" wp14:editId="61EBCF6A">
+            <wp:extent cx="5731510" cy="3582035"/>
+            <wp:effectExtent l="0" t="0" r="2540" b="0"/>
+            <wp:docPr id="552442265" name="Picture 1"/>
+            <wp:cNvGraphicFramePr>
+              <a:graphicFrameLocks xmlns:a="http://schemas.openxmlformats.org/drawingml/2006/main" noChangeAspect="1"/>
+            </wp:cNvGraphicFramePr>
+            <a:graphic xmlns:a="http://schemas.openxmlformats.org/drawingml/2006/main">
+              <a:graphicData uri="http://schemas.openxmlformats.org/drawingml/2006/picture">
+                <pic:pic xmlns:pic="http://schemas.openxmlformats.org/drawingml/2006/picture">
+                  <pic:nvPicPr>
+                    <pic:cNvPr id="552442265" name=""/>
+                    <pic:cNvPicPr/>
+                  </pic:nvPicPr>
+                  <pic:blipFill>
+                    <a:blip r:embed="rId13"/>
+                    <a:stretch>
+                      <a:fillRect/>
+                    </a:stretch>
+                  </pic:blipFill>
+                  <pic:spPr>
+                    <a:xfrm>
+                      <a:off x="0" y="0"/>
+                      <a:ext cx="5731510" cy="3582035"/>
+                    </a:xfrm>
+                    <a:prstGeom prst="rect">
+                      <a:avLst/>
+                    </a:prstGeom>
+                  </pic:spPr>
+                </pic:pic>
+              </a:graphicData>
+            </a:graphic>
+          </wp:inline>
+        </w:drawing>
+      </w:r>
+    </w:p>
+    <w:p>
+      <w:pPr>
+        <w:ind w:firstLine="720"/>
+      </w:pPr>
+      <w:r>
+        <w:rPr>
+          <w:noProof/>
+        </w:rPr>
+        <w:lastRenderedPageBreak/>
+        <w:drawing>
+          <wp:inline distT="0" distB="0" distL="0" distR="0" wp14:anchorId="68B978BA" wp14:editId="7CB023A1">
+            <wp:extent cx="5731510" cy="3582035"/>
+            <wp:effectExtent l="0" t="0" r="2540" b="0"/>
+            <wp:docPr id="772776475" name="Picture 1"/>
+            <wp:cNvGraphicFramePr>
+              <a:graphicFrameLocks xmlns:a="http://schemas.openxmlformats.org/drawingml/2006/main" noChangeAspect="1"/>
+            </wp:cNvGraphicFramePr>
+            <a:graphic xmlns:a="http://schemas.openxmlformats.org/drawingml/2006/main">
+              <a:graphicData uri="http://schemas.openxmlformats.org/drawingml/2006/picture">
+                <pic:pic xmlns:pic="http://schemas.openxmlformats.org/drawingml/2006/picture">
+                  <pic:nvPicPr>
+                    <pic:cNvPr id="772776475" name=""/>
+                    <pic:cNvPicPr/>
+                  </pic:nvPicPr>
+                  <pic:blipFill>
+                    <a:blip r:embed="rId14"/>
+                    <a:stretch>
+                      <a:fillRect/>
+                    </a:stretch>
+                  </pic:blipFill>
+                  <pic:spPr>
+                    <a:xfrm>
+                      <a:off x="0" y="0"/>
+                      <a:ext cx="5731510" cy="3582035"/>
+                    </a:xfrm>
+                    <a:prstGeom prst="rect">
+                      <a:avLst/>
+                    </a:prstGeom>
+                  </pic:spPr>
+                </pic:pic>
+              </a:graphicData>
+            </a:graphic>
+          </wp:inline>
+        </w:drawing>
+      </w:r>
+    </w:p>
+    <w:p>
+      <w:pPr>
+        <w:ind w:firstLine="720"/>
+        <w:rPr>
+          <w:noProof/>
+        </w:rPr>
+      </w:pPr>
+      <w:r>
+        <w:rPr>
+          <w:noProof/>
+        </w:rPr>
+        <w:drawing>
+          <wp:inline distT="0" distB="0" distL="0" distR="0" wp14:anchorId="08A65AFF" wp14:editId="101CB76F">
+            <wp:extent cx="5731510" cy="3582035"/>
+            <wp:effectExtent l="0" t="0" r="2540" b="0"/>
+            <wp:docPr id="2019233034" name="Picture 1"/>
+            <wp:cNvGraphicFramePr>
+              <a:graphicFrameLocks xmlns:a="http://schemas.openxmlformats.org/drawingml/2006/main" noChangeAspect="1"/>
+            </wp:cNvGraphicFramePr>
+            <a:graphic xmlns:a="http://schemas.openxmlformats.org/drawingml/2006/main">
+              <a:graphicData uri="http://schemas.openxmlformats.org/drawingml/2006/picture">
+                <pic:pic xmlns:pic="http://schemas.openxmlformats.org/drawingml/2006/picture">
+                  <pic:nvPicPr>
+                    <pic:cNvPr id="2019233034" name=""/>
+                    <pic:cNvPicPr/>
+                  </pic:nvPicPr>
+                  <pic:blipFill>
+                    <a:blip r:embed="rId15"/>
+                    <a:stretch>
+                      <a:fillRect/>
+                    </a:stretch>
+                  </pic:blipFill>
+                  <pic:spPr>
+                    <a:xfrm>
+                      <a:off x="0" y="0"/>
+                      <a:ext cx="5731510" cy="3582035"/>
+                    </a:xfrm>
+                    <a:prstGeom prst="rect">
+                      <a:avLst/>
+                    </a:prstGeom>
+                  </pic:spPr>
+                </pic:pic>
+              </a:graphicData>
+            </a:graphic>
+          </wp:inline>
+        </w:drawing>
+      </w:r>
+    </w:p>
+    <w:p/>
+    <w:p>
+      <w:pPr>
+        <w:rPr>
+          <w:noProof/>
+        </w:rPr>
+      </w:pPr>
+    </w:p>
+    <w:p>
+      <w:pPr>
+        <w:tabs>
+          <w:tab w:val="left" w:pos="2870"/>
+        </w:tabs>
+      </w:pPr>
+      <w:r>
+        <w:lastRenderedPageBreak/>
+        <w:tab/>
+      </w:r>
+      <w:r>
+        <w:rPr>
+          <w:noProof/>
+        </w:rPr>
+        <w:drawing>
+          <wp:inline distT="0" distB="0" distL="0" distR="0" wp14:anchorId="792461F5" wp14:editId="69ACF76B">
+            <wp:extent cx="5731510" cy="3582035"/>
+            <wp:effectExtent l="0" t="0" r="2540" b="0"/>
+            <wp:docPr id="1637030013" name="Picture 1"/>
+            <wp:cNvGraphicFramePr>
+              <a:graphicFrameLocks xmlns:a="http://schemas.openxmlformats.org/drawingml/2006/main" noChangeAspect="1"/>
+            </wp:cNvGraphicFramePr>
+            <a:graphic xmlns:a="http://schemas.openxmlformats.org/drawingml/2006/main">
+              <a:graphicData uri="http://schemas.openxmlformats.org/drawingml/2006/picture">
+                <pic:pic xmlns:pic="http://schemas.openxmlformats.org/drawingml/2006/picture">
+                  <pic:nvPicPr>
+                    <pic:cNvPr id="1637030013" name=""/>
+                    <pic:cNvPicPr/>
+                  </pic:nvPicPr>
+                  <pic:blipFill>
+                    <a:blip r:embed="rId16"/>
                     <a:stretch>
                       <a:fillRect/>
                     </a:stretch>

</xml_diff>